<commit_message>
Day 6 Lab Solutions
</commit_message>
<xml_diff>
--- a/INBRE_Biostatistics_Summer_2026_Syllabus.docx
+++ b/INBRE_Biostatistics_Summer_2026_Syllabus.docx
@@ -515,70 +515,24 @@
             <w:vAlign w:val="center"/>
           </w:tcPr>
           <w:p>
-            <w:r>
-              <w:rPr>
-                <w:color w:val="000000"/>
-                <w:sz w:val="20"/>
-                <w:szCs w:val="20"/>
-              </w:rPr>
-              <w:fldChar w:fldCharType="begin"/>
-            </w:r>
-            <w:r>
-              <w:rPr>
-                <w:color w:val="000000"/>
-                <w:sz w:val="20"/>
-                <w:szCs w:val="20"/>
-              </w:rPr>
-              <w:instrText>HYPERLINK "mailto:</w:instrText>
-            </w:r>
-            <w:r>
-              <w:rPr>
-                <w:color w:val="000000"/>
-                <w:sz w:val="20"/>
-                <w:szCs w:val="20"/>
-              </w:rPr>
-              <w:instrText>ELAINAKM@email.sc.edu</w:instrText>
-            </w:r>
-            <w:r>
-              <w:rPr>
-                <w:color w:val="000000"/>
-                <w:sz w:val="20"/>
-                <w:szCs w:val="20"/>
-              </w:rPr>
-              <w:instrText>"</w:instrText>
-            </w:r>
-            <w:r>
-              <w:rPr>
-                <w:color w:val="000000"/>
-                <w:sz w:val="20"/>
-                <w:szCs w:val="20"/>
-              </w:rPr>
-              <w:fldChar w:fldCharType="separate"/>
-            </w:r>
-            <w:r>
-              <w:rPr>
-                <w:rStyle w:val="Hyperlink"/>
-                <w:sz w:val="20"/>
-                <w:szCs w:val="20"/>
-              </w:rPr>
-              <w:t>elainakm</w:t>
-            </w:r>
-            <w:r>
-              <w:rPr>
-                <w:rStyle w:val="Hyperlink"/>
-                <w:sz w:val="20"/>
-                <w:szCs w:val="20"/>
-              </w:rPr>
-              <w:t>@email.sc.edu</w:t>
-            </w:r>
-            <w:r>
-              <w:rPr>
-                <w:color w:val="000000"/>
-                <w:sz w:val="20"/>
-                <w:szCs w:val="20"/>
-              </w:rPr>
-              <w:fldChar w:fldCharType="end"/>
-            </w:r>
+            <w:hyperlink r:id="rId7" w:history="1">
+              <w:r>
+                <w:rPr>
+                  <w:rStyle w:val="Hyperlink"/>
+                  <w:sz w:val="20"/>
+                  <w:szCs w:val="20"/>
+                </w:rPr>
+                <w:t>elainakm</w:t>
+              </w:r>
+              <w:r>
+                <w:rPr>
+                  <w:rStyle w:val="Hyperlink"/>
+                  <w:sz w:val="20"/>
+                  <w:szCs w:val="20"/>
+                </w:rPr>
+                <w:t>@email.sc.edu</w:t>
+              </w:r>
+            </w:hyperlink>
             <w:r>
               <w:rPr>
                 <w:color w:val="000000"/>
@@ -641,13 +595,23 @@
             <w:vAlign w:val="center"/>
           </w:tcPr>
           <w:p>
-            <w:r>
-              <w:rPr>
-                <w:color w:val="000000"/>
-                <w:sz w:val="20"/>
-                <w:szCs w:val="20"/>
-              </w:rPr>
-              <w:t>https://www.scinbre.org/learning/bids-tutorials-and-workshops/2026-summer-workshop</w:t>
+            <w:hyperlink r:id="rId8" w:history="1">
+              <w:r>
+                <w:rPr>
+                  <w:rStyle w:val="Hyperlink"/>
+                  <w:sz w:val="20"/>
+                  <w:szCs w:val="20"/>
+                </w:rPr>
+                <w:t>https://www.scinbre.org/learning/bids-tutorials-and-workshops/2026-summer-workshop</w:t>
+              </w:r>
+            </w:hyperlink>
+            <w:r>
+              <w:rPr>
+                <w:color w:val="000000"/>
+                <w:sz w:val="20"/>
+                <w:szCs w:val="20"/>
+              </w:rPr>
+              <w:t xml:space="preserve"> </w:t>
             </w:r>
           </w:p>
         </w:tc>
@@ -709,7 +673,47 @@
                 <w:sz w:val="20"/>
                 <w:szCs w:val="20"/>
               </w:rPr>
+              <w:fldChar w:fldCharType="begin"/>
+            </w:r>
+            <w:r>
+              <w:rPr>
+                <w:color w:val="000000"/>
+                <w:sz w:val="20"/>
+                <w:szCs w:val="20"/>
+              </w:rPr>
+              <w:instrText>HYPERLINK "https://github.com/alexmclain/INBRE-Bios-Summer-26"</w:instrText>
+            </w:r>
+            <w:r>
+              <w:rPr>
+                <w:color w:val="000000"/>
+                <w:sz w:val="20"/>
+                <w:szCs w:val="20"/>
+              </w:rPr>
+              <w:fldChar w:fldCharType="separate"/>
+            </w:r>
+            <w:r>
+              <w:rPr>
+                <w:rStyle w:val="Hyperlink"/>
+                <w:sz w:val="20"/>
+                <w:szCs w:val="20"/>
+              </w:rPr>
               <w:t>https://github.com/alexmclain/INBRE-Bios-Summer-26</w:t>
+            </w:r>
+            <w:r>
+              <w:rPr>
+                <w:color w:val="000000"/>
+                <w:sz w:val="20"/>
+                <w:szCs w:val="20"/>
+              </w:rPr>
+              <w:fldChar w:fldCharType="end"/>
+            </w:r>
+            <w:r>
+              <w:rPr>
+                <w:color w:val="000000"/>
+                <w:sz w:val="20"/>
+                <w:szCs w:val="20"/>
+              </w:rPr>
+              <w:t xml:space="preserve"> </w:t>
             </w:r>
           </w:p>
         </w:tc>
@@ -1299,7 +1303,7 @@
           <w:bCs/>
         </w:rPr>
       </w:pPr>
-      <w:hyperlink r:id="rId7" w:history="1">
+      <w:hyperlink r:id="rId9" w:history="1">
         <w:r>
           <w:rPr>
             <w:rStyle w:val="Hyperlink"/>
@@ -1419,7 +1423,7 @@
       <w:r>
         <w:t xml:space="preserve">R (version 4.3 or later): </w:t>
       </w:r>
-      <w:hyperlink r:id="rId8" w:history="1">
+      <w:hyperlink r:id="rId10" w:history="1">
         <w:r>
           <w:rPr>
             <w:rStyle w:val="Hyperlink"/>
@@ -1443,7 +1447,7 @@
       <w:r>
         <w:t xml:space="preserve">RStudio Desktop: </w:t>
       </w:r>
-      <w:hyperlink r:id="rId9" w:history="1">
+      <w:hyperlink r:id="rId11" w:history="1">
         <w:r>
           <w:rPr>
             <w:rStyle w:val="Hyperlink"/>
@@ -2792,6 +2796,7 @@
                 <w:sz w:val="20"/>
                 <w:szCs w:val="20"/>
               </w:rPr>
+              <w:lastRenderedPageBreak/>
               <w:t>Tue Day 2</w:t>
             </w:r>
           </w:p>
@@ -6890,7 +6895,7 @@
       <w:r>
         <w:t xml:space="preserve"> (</w:t>
       </w:r>
-      <w:hyperlink r:id="rId10" w:history="1">
+      <w:hyperlink r:id="rId12" w:history="1">
         <w:r>
           <w:rPr>
             <w:rStyle w:val="Hyperlink"/>
@@ -6909,7 +6914,7 @@
       <w:pPr>
         <w:spacing w:before="60" w:after="60"/>
       </w:pPr>
-      <w:hyperlink r:id="rId11" w:history="1">
+      <w:hyperlink r:id="rId13" w:history="1">
         <w:r>
           <w:rPr>
             <w:rStyle w:val="Hyperlink"/>

</xml_diff>